<commit_message>
Checkpoint - Comfortable w/ Sharing this One
</commit_message>
<xml_diff>
--- a/knowledge/previousReports/01_30_2026_report.docx
+++ b/knowledge/previousReports/01_30_2026_report.docx
@@ -18,13 +18,13 @@
     <w:p/>
     <w:p>
       <w:r>
-        <w:t>Today is generally better on top-line revenue but mixed through the funnel: gross calls are up (~6,600 vs baseline) and total revenue improved materially (≈$94.5K), but the quality and path-to-purchase signal is uneven. The lift is clearly driven by partner channels — Brand Partner and Competitor buckets show outsized increases in volume and revenue — while Natural underperformed, so retrieved context suggests a marketing/partner mix shift rather than a pure demand increase. More callers are entering Compass (entered rate materially higher) but Compass bot-handling fell, so more interactions are converting into non-bot handoffs to IVR/agents.</w:t>
+        <w:t>Today was a better-than-normal day: top-of-funnel volume was up ~10% and orders and revenue both rose materially (orders +~20%, total revenue +24%), driven largely by stronger performance from brand-partner and competitor channels. Compass showed healthier engagement—entered rate jumped and bot interactions fell, which suggests more calls made it to live handling and CIContact/CICredit signals ticked up slightly—however non-bot Compass conversion fell sharply. That divergence points to a mix shift: more callers entered Compass but a larger share were lower intent or needed additional qualification, so Compass drove volume into the funnel but constrained conversion efficiency.</w:t>
       </w:r>
     </w:p>
     <w:p/>
     <w:p>
       <w:r>
-        <w:t>On queueing and routing, Q2G ticked up modestly and queue volumes rose, with abandonment still very low, implying routing and IVR are absorbing the extra load. Conversion is the concern: gross conversion improved slightly but transactional conversion per entered call fell sharply (~43%), and net conversion at the overall level is not reported — pointing to weaker checkout efficiency or lower-intent traffic from partner streams. Revenue quality however looks OK at the order level — RPO is roughly stable and RPGC (revenue per gross call) is higher today — so the business captured dollars despite conversion strain. Action: prioritize quick triage of partner creative/landing intent and Compass routing (bot flows, ZIP/name collection breakage and ERCOT match behavior) to restore conversion efficiency while preserving the partner-driven revenue uplift.</w:t>
+        <w:t>From an operations perspective routing and agent execution held up: queueing increased but Q2G and net contact rates improved, abandonment remained negligible, and agents converted enough of the higher-intent traffic to lift RPGC and RPO (revenue per gross and net call both higher). The net effect is healthy revenue delivery today, but the drop in non-bot conversion is a clear signal to investigate lead quality and early breakage (ZIP/Name collection and credit flows) by partner. Recommended next steps: preserve staffing and routing that sustained Q2G, and prioritize short root-cause work on partner mix/Compass qualification to restore conversion without sacrificing the volume gains.</w:t>
       </w:r>
     </w:p>
     <w:p/>
@@ -37,17 +37,17 @@
     <w:p/>
     <w:p>
       <w:r>
-        <w:t>1. Partner / brand volume spike (brand_partner &amp; other_bucket)</w:t>
+        <w:t>1. Compass intake surged while bot-handling fell (more non-bot calls reaching agents)</w:t>
       </w:r>
     </w:p>
     <w:p>
       <w:r>
-        <w:t xml:space="preserve">   What happened: Brand_partner gross_calls rose ~43% (1281 vs 893 baseline) and other_bucket gross_calls rose ~34% (1200 vs 892 baseline), driving a large lift in entered-Compass volume from partner channels.</w:t>
+        <w:t xml:space="preserve">   What happened: Entered-Compass calls jumped (~+1,300) and entered_compass_rate rose ~29%, while any_bot_call_rate_compass fell ~27%, so a much larger share of calls hit agents as non-bot traffic.</w:t>
       </w:r>
     </w:p>
     <w:p>
       <w:r>
-        <w:t xml:space="preserve">   Impact: Lifted overall orders (+20%) and total revenue (+24%) but changed call mix toward more live/non-bot calls, increasing downstream operational load and revenue concentration by partner.</w:t>
+        <w:t xml:space="preserve">   Impact: Increased agent-facing volume coincided with a large drop in non-bot_compass_conversion_rate (-~43 pp relative delta), lowering conversion efficiency even as raw orders and revenue rose.</w:t>
       </w:r>
     </w:p>
     <w:p>
@@ -57,38 +57,38 @@
     </w:p>
     <w:p>
       <w:r>
-        <w:t xml:space="preserve">     1) Quick: Pull last 24h partner IDs and campaign tags to confirm which partner(s) drove the spike.</w:t>
+        <w:t xml:space="preserve">     1) Segment entered_compass by marketing source/campaign and by bucket to find which source(s) drove the jump in non-bot volume</w:t>
       </w:r>
     </w:p>
     <w:p>
       <w:r>
-        <w:t xml:space="preserve">     2) Segment RPGC/RPO and revenue_per_order by partner to identify high/low quality sources.</w:t>
+        <w:t xml:space="preserve">     2) Compare Compass bot logs and recent configuration changes to identify why bot handling fell (rule changes, NLU threshold, or feed mapping)</w:t>
       </w:r>
     </w:p>
     <w:p>
       <w:r>
-        <w:t xml:space="preserve">     3) If a partner promo is live, validate feed/landing page and confirm expected duration; coordinate with Partner Economics on expected yield.</w:t>
+        <w:t xml:space="preserve">     3) Analyze step-level pass rates (CIContact/CICredit/Initial Question/ERCOT) for non-bot calls vs baseline to see where quality degraded</w:t>
       </w:r>
     </w:p>
     <w:p>
       <w:r>
-        <w:t xml:space="preserve">   Evidence: retrieved: TODAY_KPI_JSON (bucket_brand_partner and bucket_other_bucket show large increases in gross_calls, entered_compass, non_bot_compass_calls, and total_revenue)</w:t>
+        <w:t xml:space="preserve">   Evidence: none</w:t>
       </w:r>
     </w:p>
     <w:p/>
     <w:p>
       <w:r>
-        <w:t>2. Sharp drop in Compass bot engagement (bot deflection down)</w:t>
+        <w:t>2. Partner mix shifted to high-volume brand_partner and other_bucket traffic</w:t>
       </w:r>
     </w:p>
     <w:p>
       <w:r>
-        <w:t xml:space="preserve">   What happened: any_bot_call_rate_compass fell ~27.6% (0.455 vs 0.629 baseline) while non_bot_compass_calls increased ~79.8%, indicating fewer callers handled by bot flows and more routed to live/IVR.</w:t>
+        <w:t xml:space="preserve">   What happened: Brand_partner gross_calls rose sharply (+~388) and other_bucket also increased (+~308), with brand_partner showing big lifts in entered_compass and queue volume.</w:t>
       </w:r>
     </w:p>
     <w:p>
       <w:r>
-        <w:t xml:space="preserve">   Impact: Produced higher live/IVR volumes (ivr_completed_calls +31%) and queue load, contributing to lower transactional conversion rate and higher operational demand.</w:t>
+        <w:t xml:space="preserve">   Impact: This partner mix increased total revenue and revenue_per_gross_call (brand_partner revenue up materially), but also concentrated queue load and may have affected conversion mix and RPGC.</w:t>
       </w:r>
     </w:p>
     <w:p>
@@ -98,38 +98,38 @@
     </w:p>
     <w:p>
       <w:r>
-        <w:t xml:space="preserve">     1) Quick: Check bot service health/logs and recent deployments for errors or rollback events in the last 24 hours.</w:t>
+        <w:t xml:space="preserve">     1) Break down brand_partner and other_bucket by partner ID/campaign to identify which partner(s) drove the lift</w:t>
       </w:r>
     </w:p>
     <w:p>
       <w:r>
-        <w:t xml:space="preserve">     2) Test key Compass bot intents end-to-end (CIContact/CICredit flows) to confirm NLU or API failures.</w:t>
+        <w:t xml:space="preserve">     2) Check routing/prioritization logs to see if partner calls were routed differently (priority routing, agent pools) that changed Q2G or contact outcomes</w:t>
       </w:r>
     </w:p>
     <w:p>
       <w:r>
-        <w:t xml:space="preserve">     3) If no infra issue, compare traffic source mix (partner vs natural) to see if new callers are less likely to engage bots and adjust bot prompts/UX.</w:t>
+        <w:t xml:space="preserve">     3) Compare partner-level credit_rate/contact_rate/non-bot_conversion to baseline to evaluate revenue quality per partner</w:t>
       </w:r>
     </w:p>
     <w:p>
       <w:r>
-        <w:t xml:space="preserve">   Evidence: retrieved: TODAY_KPI_JSON (any_bot_call_rate_compass down, non_bot_compass_calls_count and ivr_completed_calls up)</w:t>
+        <w:t xml:space="preserve">   Evidence: none</w:t>
       </w:r>
     </w:p>
     <w:p/>
     <w:p>
       <w:r>
-        <w:t>3. Increased queueing / IVR→queue flow and slight rise in abandonment</w:t>
+        <w:t>3. Natural channel conversion and revenue per net-call weakened despite volume</w:t>
       </w:r>
     </w:p>
     <w:p>
       <w:r>
-        <w:t xml:space="preserve">   What happened: Queue calls rose ~20% (1003 vs 836 baseline) and queue_to_ivr_rate increased ~16%, with ivr_completed_calls up and abandonment_rate more than doubling (though absolute % remains small).</w:t>
+        <w:t xml:space="preserve">   What happened: Natural gross_calls near baseline but entered_compass and non-bot_compass_calls rose; however orders fell (-12.5) and non_bot_compass_conversion_rate collapsed (from ~0.151 to ~0.049).</w:t>
       </w:r>
     </w:p>
     <w:p>
       <w:r>
-        <w:t xml:space="preserve">   Impact: Higher queue pressure correlated with a sharp drop in transactional_conversion_rate (-43%), likely reducing fast, bot-driven transactions and lowering Q2G efficiency.</w:t>
+        <w:t xml:space="preserve">   Impact: Natural channel underperformance dragged overall conversion and reduced total revenue for that bucket (~-3,500), offsetting some gains from partner traffic.</w:t>
       </w:r>
     </w:p>
     <w:p>
@@ -139,22 +139,22 @@
     </w:p>
     <w:p>
       <w:r>
-        <w:t xml:space="preserve">     1) Quick: Check real-time ACD metrics (average queue wait, longest wait, ASA) and agent staffing/overflow settings for the last 6–12 hours.</w:t>
+        <w:t xml:space="preserve">     1) Segment Natural callers by intent (moving vs switching vs ERCOT match) and compare conversion, credit and contact rates to locate the weakest intent cohort</w:t>
       </w:r>
     </w:p>
     <w:p>
       <w:r>
-        <w:t xml:space="preserve">     2) Validate IVR routing rules and recent changes to queue thresholds or skill-based routing that might increase queueing.</w:t>
+        <w:t xml:space="preserve">     2) Audit Compass step breakage for Natural (address collection, ERCOT checks, ZIP collection) to see where Natural calls failed the funnel</w:t>
       </w:r>
     </w:p>
     <w:p>
       <w:r>
-        <w:t xml:space="preserve">     3) If capacity constrained, enable overflow routing or temporary callback to preserve conversion while staffing is adjusted.</w:t>
+        <w:t xml:space="preserve">     3) Compare agent groups handling Natural calls (shift/skill/routing) to see if different agents or routing rules correlate with the conversion drop</w:t>
       </w:r>
     </w:p>
     <w:p>
       <w:r>
-        <w:t xml:space="preserve">   Evidence: retrieved: TODAY_KPI_JSON (queue_calls, queue_to_ivr_rate, ivr_completed_calls, abandonment_rate, and transactional_conversion_rate changes)</w:t>
+        <w:t xml:space="preserve">   Evidence: none</w:t>
       </w:r>
     </w:p>
     <w:p/>
@@ -167,17 +167,56 @@
     <w:p/>
     <w:p>
       <w:r>
-        <w:t>1. [A1] Compass ingestion outage for Site &amp; SERP (entered_compass_rate = 0) (severity: critical)</w:t>
+        <w:t>1. [ALERT_1] Sharp drop in any_bot_call_rate_compass (severity: unknown)</w:t>
       </w:r>
     </w:p>
     <w:p>
       <w:r>
-        <w:t xml:space="preserve">   Why: Site and SERP sources report entered_compass_calls_count = 0 and entered_compass_rate = 0 while gross_calls remain high (Site gross_calls=4965, SERP gross_calls=1659). This indicates Compass ingestion or tagging failure for primary acquisition channels causing loss of Compass-driven routing/metrics (CIContact attribution).</w:t>
+        <w:t xml:space="preserve">   Evidence: none</w:t>
+      </w:r>
+    </w:p>
+    <w:p/>
+    <w:p>
+      <w:r>
+        <w:t>2. [ALERT_2] Surge in agent-eligible calls (entered_compass) and non-bot volume (severity: unknown)</w:t>
       </w:r>
     </w:p>
     <w:p>
       <w:r>
-        <w:t xml:space="preserve">   Evidence: {'site_entered_compass_calls_count_current': 0, 'site_entered_compass_calls_count_baseline': 2978.5, 'serp_entered_compass_calls_count_current': 0, 'serp_entered_compass_calls_count_baseline': 645.0, 'site_gross_calls_current': 4965, 'serp_gross_calls_current': 1659}</w:t>
+        <w:t xml:space="preserve">   Evidence: none</w:t>
+      </w:r>
+    </w:p>
+    <w:p/>
+    <w:p>
+      <w:r>
+        <w:t>3. [ALERT_3] Non-bot compass conversion rate collapsed while orders rose (severity: unknown)</w:t>
+      </w:r>
+    </w:p>
+    <w:p>
+      <w:r>
+        <w:t xml:space="preserve">   Evidence: none</w:t>
+      </w:r>
+    </w:p>
+    <w:p/>
+    <w:p>
+      <w:r>
+        <w:t>4. [ALERT_4] Abandonment increased and queue volume up (severity: unknown)</w:t>
+      </w:r>
+    </w:p>
+    <w:p>
+      <w:r>
+        <w:t xml:space="preserve">   Evidence: none</w:t>
+      </w:r>
+    </w:p>
+    <w:p/>
+    <w:p>
+      <w:r>
+        <w:t>5. [ALERT_5] Missing/zero entered_compass for major buckets (pmax, utility, site) (severity: unknown)</w:t>
+      </w:r>
+    </w:p>
+    <w:p>
+      <w:r>
+        <w:t xml:space="preserve">   Evidence: none</w:t>
       </w:r>
     </w:p>
     <w:sectPr>

</xml_diff>